<commit_message>
Add pdf of write up
</commit_message>
<xml_diff>
--- a/Task 2 WriteUp - Jeroen Buil.docx
+++ b/Task 2 WriteUp - Jeroen Buil.docx
@@ -78,6 +78,7 @@
           <w:highlight w:val="none"/>
           <w:lang w:val="en-US"/>
         </w:rPr>
+        <w:t xml:space="preserve"> – PsychoPy: Posner cueing task</w:t>
       </w:r>
       <w:r>
         <w:rPr>
@@ -418,8 +419,6 @@
         <w:rPr>
           <w:b/>
           <w:bCs/>
-          <w:highlight w:val="none"/>
-          <w:lang w:val="en-US"/>
         </w:rPr>
       </w:r>
       <w:r>
@@ -1073,7 +1072,7 @@
       <w:r>
         <w:rPr>
           <w:highlight w:val="none"/>
-          <w:lang w:val="en-US" w:bidi="en-US"/>
+          <w:lang w:val="en-US"/>
         </w:rPr>
       </w:r>
       <w:r>

</xml_diff>

<commit_message>
Describe loop block structure
</commit_message>
<xml_diff>
--- a/Task 2 WriteUp - Jeroen Buil.docx
+++ b/Task 2 WriteUp - Jeroen Buil.docx
@@ -377,6 +377,50 @@
       </w:r>
       <w:r>
         <w:rPr>
+          <w:lang w:val="en-US"/>
+        </w:rPr>
+      </w:r>
+    </w:p>
+    <w:p>
+      <w:pPr>
+        <w:pStyle w:val="922"/>
+        <w:numPr>
+          <w:ilvl w:val="0"/>
+          <w:numId w:val="10"/>
+        </w:numPr>
+        <w:pBdr/>
+        <w:shd w:val="nil" w:color="000000"/>
+        <w:spacing/>
+        <w:ind/>
+        <w:rPr>
+          <w:lang w:val="en-US"/>
+        </w:rPr>
+      </w:pPr>
+      <w:r>
+        <w:rPr>
+          <w:b/>
+          <w:bCs/>
+          <w:highlight w:val="none"/>
+          <w:lang w:val="en-US" w:bidi="en-US"/>
+        </w:rPr>
+        <w:t xml:space="preserve">Loop only covers trial and ITI routines</w:t>
+      </w:r>
+      <w:r>
+        <w:rPr>
+          <w:highlight w:val="none"/>
+          <w:lang w:val="en-US" w:bidi="en-US"/>
+        </w:rPr>
+        <w:t xml:space="preserve">, the setup, instructions and end message should only appear before the looping of the trials. The number of trial repetitions is set with the nRep (Number of Repetitions) setting inside the loop.</w:t>
+      </w:r>
+      <w:r>
+        <w:rPr>
+          <w:highlight w:val="none"/>
+          <w:lang w:val="en-US" w:bidi="en-US"/>
+        </w:rPr>
+      </w:r>
+      <w:r>
+        <w:rPr>
+          <w:highlight w:val="none"/>
           <w:lang w:val="en-US"/>
         </w:rPr>
       </w:r>

</xml_diff>

<commit_message>
Add PsychoPy Builder in doc
</commit_message>
<xml_diff>
--- a/Task 2 WriteUp - Jeroen Buil.docx
+++ b/Task 2 WriteUp - Jeroen Buil.docx
@@ -86,6 +86,12 @@
           <w:lang w:val="en-US"/>
         </w:rPr>
       </w:r>
+      <w:r>
+        <w:rPr>
+          <w:highlight w:val="none"/>
+          <w:lang w:val="en-US"/>
+        </w:rPr>
+      </w:r>
     </w:p>
     <w:p>
       <w:pPr>
@@ -140,6 +146,42 @@
       <w:r>
         <w:rPr>
           <w:highlight w:val="none"/>
+          <w:lang w:val="en-US"/>
+        </w:rPr>
+      </w:r>
+    </w:p>
+    <w:p>
+      <w:pPr>
+        <w:pBdr/>
+        <w:spacing/>
+        <w:ind/>
+        <w:rPr>
+          <w:lang w:val="en-US"/>
+        </w:rPr>
+      </w:pPr>
+      <w:r>
+        <w:rPr>
+          <w:highlight w:val="none"/>
+          <w:lang w:val="en-US" w:bidi="en-US"/>
+        </w:rPr>
+        <w:t xml:space="preserve">I designed the task (</w:t>
+      </w:r>
+      <w:r>
+        <w:rPr>
+          <w:highlight w:val="none"/>
+          <w:lang w:val="en-US" w:bidi="en-US"/>
+        </w:rPr>
+        <w:t xml:space="preserve">Posner_Cueing_Task</w:t>
+      </w:r>
+      <w:r>
+        <w:rPr>
+          <w:highlight w:val="none"/>
+          <w:lang w:val="en-US" w:bidi="en-US"/>
+        </w:rPr>
+        <w:t xml:space="preserve">.psyexp) in PsychoPy Builder as the official documentation noted potential problems when running on Linux (typing this on CachyOS). To avoid unnecessary delays I opted for designing the experiment this way.</w:t>
+      </w:r>
+      <w:r>
+        <w:rPr>
           <w:lang w:val="en-US"/>
         </w:rPr>
       </w:r>
@@ -415,12 +457,11 @@
       <w:r>
         <w:rPr>
           <w:highlight w:val="none"/>
-          <w:lang w:val="en-US" w:bidi="en-US"/>
+          <w:lang w:val="en-US"/>
         </w:rPr>
       </w:r>
       <w:r>
         <w:rPr>
-          <w:highlight w:val="none"/>
           <w:lang w:val="en-US"/>
         </w:rPr>
       </w:r>

</xml_diff>